<commit_message>
Add database module, remove Optimize service, update docs
</commit_message>
<xml_diff>
--- a/docs/SRS_Quan_ly_kho_bai_container_v5.docx
+++ b/docs/SRS_Quan_ly_kho_bai_container_v5.docx
@@ -40,7 +40,7 @@
         <w:rPr>
           <w:i/>
         </w:rPr>
-        <w:t>Phiên bản 5.0 — Ngày cập nhật: 21/09/2026</w:t>
+        <w:t>Phiên bản 6.0 — Ngày cập nhật: 28/09/2026</w:t>
       </w:r>
     </w:p>
     <w:p>
@@ -52,7 +52,7 @@
         <w:rPr>
           <w:i/>
         </w:rPr>
-        <w:t>Bản cập nhật từ v4.0, sửa các lỗi logic nghiệp vụ và bổ sung các nhánh còn thiếu phát hiện khi rà soát state machine. Toàn bộ chi tiết state machine (chuyển trạng thái, trigger, cross-entity side-effect) đã được TÁCH RIÊNG sang tài liệu State_Business_Kho_bai_Container_v1.docx — SRS này chỉ tham chiếu tới, không lặp lại toàn bộ bảng.</w:t>
+        <w:t>Bản cập nhật từ v5.0: bỏ kiến trúc 2 service (Yard Optimize Service, Message Broker) và thuật toán Slot Allocation — đơn giản hóa theo dõi vị trí container ở mức Warehouse (kho); bổ sung quản lý Warehouse và Vehicle theo đúng phạm vi đề bài gốc. Toàn bộ chi tiết state machine (chuyển trạng thái, trigger, cross-entity side-effect) đã được TÁCH RIÊNG sang tài liệu State_Business_Kho_bai_Container_v1.docx — SRS này chỉ tham chiếu tới, không lặp lại toàn bộ bảng.</w:t>
       </w:r>
     </w:p>
     <w:p>
@@ -99,7 +99,7 @@
           <w:b w:val="0"/>
           <w:i w:val="0"/>
         </w:rPr>
-        <w:t>Hệ thống quản lý toàn bộ vòng đời một container trong bãi: từ khi có Hợp đồng và Shipment, lập kế hoạch lưu bãi, Gate-in, kiểm tra, gán vị trí (Slot Allocation), lưu bãi, di chuyển nội bộ, cho tới Gate-out và xuất Hóa đơn/Thanh toán theo từng giai đoạn hợp đồng.</w:t>
+        <w:t>Hệ thống quản lý toàn bộ vòng đời một container trong bãi: từ khi có Hợp đồng và Shipment, lập kế hoạch lưu bãi, Gate-in, kiểm tra, gán kho lưu trữ (Warehouse), lưu bãi, di chuyển nội bộ (có thể gắn Phương tiện vận tải/Vehicle), cho tới Gate-out và xuất Hóa đơn/Thanh toán theo từng giai đoạn hợp đồng.</w:t>
       </w:r>
     </w:p>
     <w:p>
@@ -269,7 +269,7 @@
                 <w:rFonts w:ascii="Times New Roman" w:hAnsi="Times New Roman"/>
                 <w:sz w:val="24"/>
               </w:rPr>
-              <w:t>Inspection, xác nhận Gate-in/Gate-out, thực hiện Movement, xác nhận Slot Allocation, đánh giá mức độ hư hỏng container.</w:t>
+              <w:t>Inspection, xác nhận Gate-in/Gate-out, thực hiện Movement, chọn Kho lưu trữ (Warehouse), đánh giá mức độ hư hỏng container.</w:t>
             </w:r>
           </w:p>
         </w:tc>
@@ -551,7 +551,7 @@
                 <w:rFonts w:ascii="Times New Roman" w:hAnsi="Times New Roman"/>
                 <w:sz w:val="24"/>
               </w:rPr>
-              <w:t>Slot Allocation</w:t>
+              <w:t>Warehouse Assignment (Gán kho)</w:t>
             </w:r>
           </w:p>
         </w:tc>
@@ -569,7 +569,7 @@
                 <w:rFonts w:ascii="Times New Roman" w:hAnsi="Times New Roman"/>
                 <w:sz w:val="24"/>
               </w:rPr>
-              <w:t>Bài toán/chức năng gán vị trí lưu bãi tối ưu cho container khi nhập kho, gồm 2 bước: đề xuất (Reserved) và xác nhận (Occupied)</w:t>
+              <w:t>Chọn 1 Warehouse còn dung lượng trống để lưu container khi nhập kho — không dùng thuật toán tối ưu vị trí.</w:t>
             </w:r>
           </w:p>
         </w:tc>
@@ -782,7 +782,7 @@
           <w:b w:val="0"/>
           <w:i/>
         </w:rPr>
-        <w:t>Trước khi container thực sự đến bãi, Điều phối viên lập kế hoạch lưu bãi (Yard Visit Planned), ghi nhận thời gian dự kiến đến (ETA). Nếu trên đường vận chuyển xảy ra sự cố khiến container không thể tới bãi như kế hoạch (tai nạn, hủy shipment...), Yard Visit chuyển sang CANCELLED và Slot đã đặt trước (nếu có) được giải phóng ngay — xem chi tiết Case 2, mục 3.2 của tài liệu State Business.</w:t>
+        <w:t>Trước khi container thực sự đến bãi, Điều phối viên lập kế hoạch lưu bãi (Yard Visit Planned), ghi nhận thời gian dự kiến đến (ETA). Nếu trên đường vận chuyển xảy ra sự cố khiến container không thể tới bãi như kế hoạch (tai nạn, hủy shipment...), Yard Visit chuyển sang CANCELLED — xem chi tiết Case 2, mục 3.2 của tài liệu State Business.</w:t>
       </w:r>
     </w:p>
     <w:p>
@@ -809,7 +809,7 @@
           <w:b w:val="0"/>
           <w:i/>
         </w:rPr>
-        <w:t>Nếu đạt, hệ thống chuyển sang bước gán vị trí lưu bãi. Bước Slot Allocation dùng một thuật toán tính điểm để đề xuất vị trí trống phù hợp nhất (Slot chuyển Empty → Reserved), dựa trên khoảng cách tới cổng, mức độ tương thích loại container với vị trí, và mức độ cân bằng tải giữa các khu vực bãi. Khi container thực sự được đưa vào: nếu đã có vị trí đặt trước, container vào đúng vị trí đó (Reserved → Occupied); nếu chưa có (ví dụ đề xuất bị bỏ lỡ), hệ thống tính toán tức thời và gán vào một Slot Empty phù hợp (Empty → Occupied). Sau khi nhân viên kho xác nhận, container chính thức được lưu bãi, Yard Visit chuyển sang trạng thái In_Yard.</w:t>
+        <w:t>Nếu đạt, hệ thống chuyển sang bước gán kho lưu trữ. Nhân viên kho chọn một Warehouse còn dung lượng trống (capacity chưa đầy) để lưu container — không dùng thuật toán tính điểm/tối ưu vị trí. current_warehouse_id của YardVisit được cập nhật, một Movement type=Gate-in được ghi nhận. Sau khi xác nhận, container chính thức được lưu bãi, Yard Visit chuyển sang trạng thái In_Yard.</w:t>
       </w:r>
     </w:p>
     <w:p>
@@ -886,7 +886,7 @@
         <w:pStyle w:val="ListBullet"/>
       </w:pPr>
       <w:r>
-        <w:t>Vị trí bãi (Slot) là thực thể độc lập, có trạng thái riêng, phục vụ trực tiếp cho bài toán Slot Allocation. Slot Allocation là quy trình 2 bước: đề xuất trước (Reserved) rồi xác nhận khi container thực sự tới (Occupied); có đường dự phòng cho trường hợp chưa có đề xuất trước.</w:t>
+        <w:t>Vị trí lưu trữ được theo dõi ở mức Warehouse (kho) — mỗi container/Yard Visit gắn với đúng 1 Warehouse tại một thời điểm (current_warehouse_id), không tách nhỏ tới mức từng ô/slot trong kho. [SỬA v6] Bỏ thuật toán Slot Allocation (đề xuất/tối ưu vị trí) khỏi phạm vi đồ án.</w:t>
       </w:r>
     </w:p>
     <w:p>
@@ -1267,7 +1267,7 @@
         <w:pStyle w:val="ListBullet"/>
       </w:pPr>
       <w:r>
-        <w:t>3. [MỚI] Nếu xảy ra sự cố khiến container không thể tới bãi như kế hoạch (tai nạn trên đường, hủy shipment...), Yard Visit chuyển PLANNED → CANCELLED; Slot đã Reserved trước đó (nếu có) được giải phóng ngay về Empty.</w:t>
+        <w:t>3. [MỚI] Nếu xảy ra sự cố khiến container không thể tới bãi như kế hoạch (tai nạn trên đường, hủy shipment...), Yard Visit chuyển PLANNED → CANCELLED.</w:t>
       </w:r>
     </w:p>
     <w:p>
@@ -1326,7 +1326,7 @@
         <w:pStyle w:val="ListBullet"/>
       </w:pPr>
       <w:r>
-        <w:t>3. Pass → chuyển bước Slot Allocation (FR-06).</w:t>
+        <w:t>3. Pass → chuyển bước gán Kho lưu trữ (FR-06).</w:t>
       </w:r>
     </w:p>
     <w:p>
@@ -1350,7 +1350,7 @@
         <w:pStyle w:val="Heading2"/>
       </w:pPr>
       <w:r>
-        <w:t>FR-06 — Slot Allocation (gán vị trí tối ưu)</w:t>
+        <w:t>FR-06 — Gán Kho lưu trữ (Warehouse Assignment)</w:t>
       </w:r>
     </w:p>
     <w:p>
@@ -1359,7 +1359,7 @@
           <w:b w:val="0"/>
           <w:i w:val="0"/>
         </w:rPr>
-        <w:t>Actor: Nhân viên kho (hệ thống đề xuất, nhân viên xác nhận)</w:t>
+        <w:t>Actor: Nhân viên kho</w:t>
       </w:r>
     </w:p>
     <w:p>
@@ -1368,7 +1368,7 @@
           <w:b w:val="0"/>
           <w:i w:val="0"/>
         </w:rPr>
-        <w:t>Điều kiện kích hoạt: Container Pass Inspection, cần gán vị trí lưu bãi.</w:t>
+        <w:t>Điều kiện kích hoạt: Container Pass Inspection, cần gán kho lưu trữ.</w:t>
       </w:r>
     </w:p>
     <w:p>
@@ -1377,7 +1377,7 @@
           <w:b w:val="0"/>
           <w:i w:val="0"/>
         </w:rPr>
-        <w:t>Luồng chính [MỚI — làm rõ, thay thế "Đang suy nghĩ sẽ cập nhật sau" ở bản v4]:</w:t>
+        <w:t>Luồng chính [SỬA v6 — đơn giản hóa, bỏ thuật toán scoring/Slot]:</w:t>
       </w:r>
     </w:p>
     <w:p>
@@ -1385,7 +1385,7 @@
         <w:pStyle w:val="ListBullet"/>
       </w:pPr>
       <w:r>
-        <w:t>1. Hệ thống tính điểm (dựa trên distance_to_gate, compatible_type, mức cân bằng tải giữa các khu vực) và đề xuất Slot phù hợp nhất còn Empty → Slot chuyển Empty → Reserved.</w:t>
+        <w:t>1. Nhân viên kho chọn 1 Warehouse còn dung lượng trống (capacity &gt; số Yard Visit đang IN_YARD/STAGING tại kho đó).</w:t>
       </w:r>
     </w:p>
     <w:p>
@@ -1393,7 +1393,7 @@
         <w:pStyle w:val="ListBullet"/>
       </w:pPr>
       <w:r>
-        <w:t>2. Khi container thực sự Gate-in: nếu còn đúng Slot đã Reserved cho Yard Visit này → xác nhận, Slot chuyển Reserved → Occupied.</w:t>
+        <w:t>2. Khi container thực sự Gate-in: current_warehouse_id của YardVisit được set theo Warehouse đã chọn.</w:t>
       </w:r>
     </w:p>
     <w:p>
@@ -1401,7 +1401,7 @@
         <w:pStyle w:val="ListBullet"/>
       </w:pPr>
       <w:r>
-        <w:t>3. Nếu không còn Slot Reserved hợp lệ (đề xuất đã hết hạn, bị hủy...) → hệ thống tính toán lại tức thời và gán vào một Slot Empty khác → Empty → Occupied trực tiếp (đường dự phòng).</w:t>
+        <w:t>3. Nếu Warehouse đã chọn hết dung lượng trống trước khi xác nhận → yêu cầu chọn lại Warehouse khác (xem Ngoại lệ).</w:t>
       </w:r>
     </w:p>
     <w:p>
@@ -1409,7 +1409,7 @@
         <w:pStyle w:val="ListBullet"/>
       </w:pPr>
       <w:r>
-        <w:t>4. current_slot_id của YardVisit được cập nhật; Movement type=Gate-in được tạo (from_slot_id=null).</w:t>
+        <w:t>4. Movement type=Gate-in được tạo (from_warehouse_id=null, to_warehouse_id=Warehouse đã chọn), có thể gắn kèm vehicle_id nếu có phương tiện vận chuyển nội bộ tham gia.</w:t>
       </w:r>
     </w:p>
     <w:p>
@@ -1426,24 +1426,7 @@
         <w:pStyle w:val="ListBullet"/>
       </w:pPr>
       <w:r>
-        <w:t>Không còn slot phù hợp → cảnh báo quá tải khu vực/loại container.</w:t>
-      </w:r>
-    </w:p>
-    <w:p>
-      <w:pPr>
-        <w:pStyle w:val="ListBullet"/>
-      </w:pPr>
-      <w:r>
-        <w:t>[MỚI] Công thức scoring khi dùng cho Relocation (FR-07) phải cộng thêm chi phí xáo trộn các container/slot lân cận (disruption cost), không chỉ chi phí của riêng request hiện tại — để không làm gián đoạn chuỗi lấy hàng của các container khác (xem Case 3, mục 3.3 State Business).</w:t>
-      </w:r>
-    </w:p>
-    <w:p>
-      <w:r>
-        <w:rPr>
-          <w:b w:val="0"/>
-          <w:i/>
-        </w:rPr>
-        <w:t>Công thức trọng số cụ thể (weight cho từng tiêu chí) vẫn cần xác định ở giai đoạn thiết kế chi tiết/thuật toán — không thuộc phạm vi SRS.</w:t>
+        <w:t>Không còn Warehouse nào còn dung lượng trống phù hợp → cảnh báo quá tải, cần điều phối sang kho khác hoặc từ chối nhập kho.</w:t>
       </w:r>
     </w:p>
     <w:p>
@@ -1494,7 +1477,7 @@
         <w:pStyle w:val="ListBullet"/>
       </w:pPr>
       <w:r>
-        <w:t>2. Nếu cần đổi vị trí để tối ưu bãi: tạo Movement type=Relocation, tính lại score như FR-06 cho slot mới (đã bao gồm disruption cost tới các slot lân cận). Slot cũ: Occupied → Empty; Slot mới: Empty/Reserved → Occupied.</w:t>
+        <w:t>2. Nếu cần chuyển container sang kho khác (vd hết chỗ, yêu cầu điều phối lại): tạo Movement type=Relocation, chọn Warehouse mới còn dung lượng trống. from_warehouse_id = kho cũ, to_warehouse_id = kho mới, current_warehouse_id của YardVisit cập nhật theo kho mới.</w:t>
       </w:r>
     </w:p>
     <w:p>
@@ -1527,7 +1510,7 @@
         <w:pStyle w:val="ListBullet"/>
       </w:pPr>
       <w:r>
-        <w:t>Slot đích đã bị chiếm → từ chối, chọn lại.</w:t>
+        <w:t>Warehouse đích đã hết dung lượng trống → từ chối, chọn kho khác.</w:t>
       </w:r>
     </w:p>
     <w:p>
@@ -1570,7 +1553,7 @@
         <w:pStyle w:val="ListBullet"/>
       </w:pPr>
       <w:r>
-        <w:t>1. Tạo Movement type=Rehandle: di chuyển container tới slot gần cổng.</w:t>
+        <w:t>1. Tạo Movement type=Rehandle: chuẩn bị container ở khu vực thuận tiện để xuất kho (không đổi Warehouse chính, chỉ ghi nhận thao tác nội bộ).</w:t>
       </w:r>
     </w:p>
     <w:p>
@@ -1578,7 +1561,7 @@
         <w:pStyle w:val="ListBullet"/>
       </w:pPr>
       <w:r>
-        <w:t>2. Cập nhật current_slot_id, giải phóng slot cũ (Occupied → Empty), slot mới chuyển sang Occupied; Yard Visit chuyển sang STAGING. [SỬA/khẳng định so với v4] Đây là bước BẮT BUỘC — IN_YARD không được chuyển thẳng sang DEPARTED.</w:t>
+        <w:t>2. Yard Visit chuyển sang STAGING (current_warehouse_id không đổi vì vẫn ở cùng kho). [SỬA/khẳng định so với v4] Đây là bước BẮT BUỘC — IN_YARD không được chuyển thẳng sang DEPARTED.</w:t>
       </w:r>
     </w:p>
     <w:p>
@@ -1629,7 +1612,7 @@
         <w:pStyle w:val="ListBullet"/>
       </w:pPr>
       <w:r>
-        <w:t>2. Ghi atd, tạo Movement type=Gate-out (to_slot_id=null), giải phóng slot (Occupied → Empty).</w:t>
+        <w:t>2. Ghi atd, tạo Movement type=Gate-out (from_warehouse_id=Warehouse hiện tại, to_warehouse_id=null); current_warehouse_id của YardVisit set về null (container đã rời kho).</w:t>
       </w:r>
     </w:p>
     <w:p>
@@ -1797,7 +1780,7 @@
         <w:pStyle w:val="ListBullet"/>
       </w:pPr>
       <w:r>
-        <w:t>2. Nhân viên kho: dashboard tỷ lệ lấp đầy Slot theo block, danh sách container sắp vượt free time.</w:t>
+        <w:t>2. Nhân viên kho: dashboard dung lượng từng Warehouse (số Yard Visit đang lưu / capacity), danh sách container sắp vượt free time.</w:t>
       </w:r>
     </w:p>
     <w:p>
@@ -2374,6 +2357,38 @@
           </w:p>
         </w:tc>
       </w:tr>
+      <w:tr>
+        <w:tc>
+          <w:tcPr>
+            <w:tcW w:type="dxa" w:w="2880"/>
+          </w:tcPr>
+          <w:p>
+            <w:r>
+              <w:t>warehouse_id</w:t>
+            </w:r>
+          </w:p>
+        </w:tc>
+        <w:tc>
+          <w:tcPr>
+            <w:tcW w:type="dxa" w:w="2880"/>
+          </w:tcPr>
+          <w:p>
+            <w:r>
+              <w:t>Kho áp dụng hợp đồng thuê</w:t>
+            </w:r>
+          </w:p>
+        </w:tc>
+        <w:tc>
+          <w:tcPr>
+            <w:tcW w:type="dxa" w:w="2880"/>
+          </w:tcPr>
+          <w:p>
+            <w:r>
+              <w:t>FK → Warehouse</w:t>
+            </w:r>
+          </w:p>
+        </w:tc>
+      </w:tr>
     </w:tbl>
     <w:p/>
     <w:p>
@@ -4140,7 +4155,7 @@
         <w:pStyle w:val="Heading2"/>
       </w:pPr>
       <w:r>
-        <w:t>6. Slot (Yard Position)</w:t>
+        <w:t>6. Warehouse (Kho)</w:t>
       </w:r>
     </w:p>
     <w:p>
@@ -4149,7 +4164,7 @@
           <w:b w:val="0"/>
           <w:i w:val="0"/>
         </w:rPr>
-        <w:t>Vị trí vật lý trong bãi (block–row–tier). Đối tượng chính của bài toán Slot Allocation, vận hành theo quy trình 2 bước Reserved → Occupied.</w:t>
+        <w:t>Kho vật lý nơi lưu trữ container. Mỗi Contract thuê chỗ tại một Warehouse cụ thể; mỗi YardVisit tại một thời điểm chỉ thuộc đúng 1 Warehouse (current_warehouse_id).</w:t>
       </w:r>
     </w:p>
     <w:tbl>
@@ -4241,7 +4256,7 @@
                 <w:rFonts w:ascii="Times New Roman" w:hAnsi="Times New Roman"/>
                 <w:sz w:val="24"/>
               </w:rPr>
-              <w:t>slot_id</w:t>
+              <w:t>warehouse_id</w:t>
             </w:r>
           </w:p>
         </w:tc>
@@ -4297,7 +4312,7 @@
                 <w:rFonts w:ascii="Times New Roman" w:hAnsi="Times New Roman"/>
                 <w:sz w:val="24"/>
               </w:rPr>
-              <w:t>block / row / tier</w:t>
+              <w:t>name</w:t>
             </w:r>
           </w:p>
         </w:tc>
@@ -4315,7 +4330,7 @@
                 <w:rFonts w:ascii="Times New Roman" w:hAnsi="Times New Roman"/>
                 <w:sz w:val="24"/>
               </w:rPr>
-              <w:t>Tọa độ vị trí</w:t>
+              <w:t>Tên kho</w:t>
             </w:r>
           </w:p>
         </w:tc>
@@ -4352,7 +4367,7 @@
                 <w:rFonts w:ascii="Times New Roman" w:hAnsi="Times New Roman"/>
                 <w:sz w:val="24"/>
               </w:rPr>
-              <w:t>distance_to_gate</w:t>
+              <w:t>address</w:t>
             </w:r>
           </w:p>
         </w:tc>
@@ -4370,7 +4385,7 @@
                 <w:rFonts w:ascii="Times New Roman" w:hAnsi="Times New Roman"/>
                 <w:sz w:val="24"/>
               </w:rPr>
-              <w:t>Khoảng cách tới cổng (m hoặc đơn vị quy ước)</w:t>
+              <w:t>Địa chỉ kho</w:t>
             </w:r>
           </w:p>
         </w:tc>
@@ -4388,7 +4403,6 @@
                 <w:rFonts w:ascii="Times New Roman" w:hAnsi="Times New Roman"/>
                 <w:sz w:val="24"/>
               </w:rPr>
-              <w:t>Dùng trong công thức scoring</w:t>
             </w:r>
           </w:p>
         </w:tc>
@@ -4408,7 +4422,7 @@
                 <w:rFonts w:ascii="Times New Roman" w:hAnsi="Times New Roman"/>
                 <w:sz w:val="24"/>
               </w:rPr>
-              <w:t>compatible_type</w:t>
+              <w:t>capacity</w:t>
             </w:r>
           </w:p>
         </w:tc>
@@ -4426,7 +4440,7 @@
                 <w:rFonts w:ascii="Times New Roman" w:hAnsi="Times New Roman"/>
                 <w:sz w:val="24"/>
               </w:rPr>
-              <w:t>Loại container phù hợp</w:t>
+              <w:t>Sức chứa tối đa (số Yard Visit đồng thời)</w:t>
             </w:r>
           </w:p>
         </w:tc>
@@ -4444,6 +4458,7 @@
                 <w:rFonts w:ascii="Times New Roman" w:hAnsi="Times New Roman"/>
                 <w:sz w:val="24"/>
               </w:rPr>
+              <w:t>Dùng cho báo cáo dung lượng kho</w:t>
             </w:r>
           </w:p>
         </w:tc>
@@ -4463,7 +4478,7 @@
                 <w:rFonts w:ascii="Times New Roman" w:hAnsi="Times New Roman"/>
                 <w:sz w:val="24"/>
               </w:rPr>
-              <w:t>has_power_supply</w:t>
+              <w:t>created_at</w:t>
             </w:r>
           </w:p>
         </w:tc>
@@ -4481,7 +4496,7 @@
                 <w:rFonts w:ascii="Times New Roman" w:hAnsi="Times New Roman"/>
                 <w:sz w:val="24"/>
               </w:rPr>
-              <w:t>Có điện cho Reefer không</w:t>
+              <w:t>Ngày tạo</w:t>
             </w:r>
           </w:p>
         </w:tc>
@@ -4499,7 +4514,6 @@
                 <w:rFonts w:ascii="Times New Roman" w:hAnsi="Times New Roman"/>
                 <w:sz w:val="24"/>
               </w:rPr>
-              <w:t>Boolean</w:t>
             </w:r>
           </w:p>
         </w:tc>
@@ -4519,7 +4533,7 @@
                 <w:rFonts w:ascii="Times New Roman" w:hAnsi="Times New Roman"/>
                 <w:sz w:val="24"/>
               </w:rPr>
-              <w:t>status</w:t>
+              <w:t>updated_at</w:t>
             </w:r>
           </w:p>
         </w:tc>
@@ -4537,7 +4551,7 @@
                 <w:rFonts w:ascii="Times New Roman" w:hAnsi="Times New Roman"/>
                 <w:sz w:val="24"/>
               </w:rPr>
-              <w:t>Empty, Occupied, Reserved, Blocked</w:t>
+              <w:t>Ngày cập nhật gần nhất</w:t>
             </w:r>
           </w:p>
         </w:tc>
@@ -4555,7 +4569,6 @@
                 <w:rFonts w:ascii="Times New Roman" w:hAnsi="Times New Roman"/>
                 <w:sz w:val="24"/>
               </w:rPr>
-              <w:t>Xem đầy đủ transition ở State Business mục 4.4</w:t>
             </w:r>
           </w:p>
         </w:tc>
@@ -4891,7 +4904,7 @@
                 <w:rFonts w:ascii="Times New Roman" w:hAnsi="Times New Roman"/>
                 <w:sz w:val="24"/>
               </w:rPr>
-              <w:t>current_slot_id</w:t>
+              <w:t>current_warehouse_id</w:t>
             </w:r>
           </w:p>
         </w:tc>
@@ -4909,7 +4922,7 @@
                 <w:rFonts w:ascii="Times New Roman" w:hAnsi="Times New Roman"/>
                 <w:sz w:val="24"/>
               </w:rPr>
-              <w:t>Vị trí hiện tại</w:t>
+              <w:t>Kho hiện tại</w:t>
             </w:r>
           </w:p>
         </w:tc>
@@ -4927,7 +4940,7 @@
                 <w:rFonts w:ascii="Times New Roman" w:hAnsi="Times New Roman"/>
                 <w:sz w:val="24"/>
               </w:rPr>
-              <w:t>FK → Slot, cập nhật theo Movement</w:t>
+              <w:t>FK → Warehouse, cập nhật theo Movement</w:t>
             </w:r>
           </w:p>
         </w:tc>
@@ -5540,7 +5553,7 @@
           <w:b w:val="0"/>
           <w:i w:val="0"/>
         </w:rPr>
-        <w:t>Bảng cha ghi mọi lần đổi vị trí: Gate-in (= kết quả Slot Allocation), Relocation, Rehandle (= Outbound Staging), Gate-out.</w:t>
+        <w:t>Bảng cha ghi mọi lần đổi vị trí: Gate-in (= kết quả gán Kho lưu trữ), Relocation (đổi Warehouse), Rehandle (= Outbound Staging), Gate-out. Có thể gắn kèm Vehicle nếu di chuyển dùng phương tiện nội bộ.</w:t>
       </w:r>
     </w:p>
     <w:tbl>
@@ -5798,7 +5811,7 @@
                 <w:rFonts w:ascii="Times New Roman" w:hAnsi="Times New Roman"/>
                 <w:sz w:val="24"/>
               </w:rPr>
-              <w:t>from_slot_id / to_slot_id</w:t>
+              <w:t>from_warehouse_id / to_warehouse_id</w:t>
             </w:r>
           </w:p>
         </w:tc>
@@ -5816,7 +5829,7 @@
                 <w:rFonts w:ascii="Times New Roman" w:hAnsi="Times New Roman"/>
                 <w:sz w:val="24"/>
               </w:rPr>
-              <w:t>Vị trí nguồn / đích</w:t>
+              <w:t>Kho nguồn / đích</w:t>
             </w:r>
           </w:p>
         </w:tc>
@@ -5945,6 +5958,38 @@
                 <w:rFonts w:ascii="Times New Roman" w:hAnsi="Times New Roman"/>
                 <w:sz w:val="24"/>
               </w:rPr>
+            </w:r>
+          </w:p>
+        </w:tc>
+      </w:tr>
+      <w:tr>
+        <w:tc>
+          <w:tcPr>
+            <w:tcW w:type="dxa" w:w="2880"/>
+          </w:tcPr>
+          <w:p>
+            <w:r>
+              <w:t>vehicle_id</w:t>
+            </w:r>
+          </w:p>
+        </w:tc>
+        <w:tc>
+          <w:tcPr>
+            <w:tcW w:type="dxa" w:w="2880"/>
+          </w:tcPr>
+          <w:p>
+            <w:r>
+              <w:t>Phương tiện thực hiện di chuyển (nếu có)</w:t>
+            </w:r>
+          </w:p>
+        </w:tc>
+        <w:tc>
+          <w:tcPr>
+            <w:tcW w:type="dxa" w:w="2880"/>
+          </w:tcPr>
+          <w:p>
+            <w:r>
+              <w:t>FK → Vehicle, nullable</w:t>
             </w:r>
           </w:p>
         </w:tc>
@@ -7348,6 +7393,431 @@
     </w:p>
     <w:p>
       <w:pPr>
+        <w:pStyle w:val="Heading2"/>
+      </w:pPr>
+      <w:r>
+        <w:t>13. Vehicle (Phương tiện vận tải)</w:t>
+      </w:r>
+    </w:p>
+    <w:p>
+      <w:r>
+        <w:rPr>
+          <w:b w:val="0"/>
+          <w:i w:val="0"/>
+        </w:rPr>
+        <w:t>Phương tiện vận tải nội bộ (xe tải, xe đầu kéo...) dùng khi thực hiện Movement giữa các Warehouse hoặc trong nội bộ bãi. Gắn kèm Movement qua vehicle_id (FR-07).</w:t>
+      </w:r>
+    </w:p>
+    <w:tbl>
+      <w:tblPr>
+        <w:tblStyle w:val="TableGrid"/>
+        <w:tblW w:type="auto" w:w="0"/>
+        <w:jc w:val="center"/>
+        <w:tblLook w:firstColumn="1" w:firstRow="1" w:lastColumn="0" w:lastRow="0" w:noHBand="0" w:noVBand="1" w:val="04A0"/>
+      </w:tblPr>
+      <w:tblGrid>
+        <w:gridCol w:w="2880"/>
+        <w:gridCol w:w="2880"/>
+        <w:gridCol w:w="2880"/>
+      </w:tblGrid>
+      <w:tr>
+        <w:tc>
+          <w:tcPr>
+            <w:tcW w:type="dxa" w:w="2880"/>
+            <w:shd w:val="clear" w:color="auto" w:fill="D9D9D9"/>
+          </w:tcPr>
+          <w:p>
+            <w:pPr>
+              <w:ind w:firstLine="0"/>
+              <w:jc w:val="left"/>
+            </w:pPr>
+            <w:r>
+              <w:rPr>
+                <w:rFonts w:ascii="Times New Roman" w:hAnsi="Times New Roman"/>
+                <w:b/>
+                <w:sz w:val="24"/>
+              </w:rPr>
+              <w:t>Trường</w:t>
+            </w:r>
+          </w:p>
+        </w:tc>
+        <w:tc>
+          <w:tcPr>
+            <w:tcW w:type="dxa" w:w="2880"/>
+            <w:shd w:val="clear" w:color="auto" w:fill="D9D9D9"/>
+          </w:tcPr>
+          <w:p>
+            <w:pPr>
+              <w:ind w:firstLine="0"/>
+              <w:jc w:val="left"/>
+            </w:pPr>
+            <w:r>
+              <w:rPr>
+                <w:rFonts w:ascii="Times New Roman" w:hAnsi="Times New Roman"/>
+                <w:b/>
+                <w:sz w:val="24"/>
+              </w:rPr>
+              <w:t>Ý nghĩa</w:t>
+            </w:r>
+          </w:p>
+        </w:tc>
+        <w:tc>
+          <w:tcPr>
+            <w:tcW w:type="dxa" w:w="2880"/>
+            <w:shd w:val="clear" w:color="auto" w:fill="D9D9D9"/>
+          </w:tcPr>
+          <w:p>
+            <w:pPr>
+              <w:ind w:firstLine="0"/>
+              <w:jc w:val="left"/>
+            </w:pPr>
+            <w:r>
+              <w:rPr>
+                <w:rFonts w:ascii="Times New Roman" w:hAnsi="Times New Roman"/>
+                <w:b/>
+                <w:sz w:val="24"/>
+              </w:rPr>
+              <w:t>Ghi chú</w:t>
+            </w:r>
+          </w:p>
+        </w:tc>
+      </w:tr>
+      <w:tr>
+        <w:tc>
+          <w:tcPr>
+            <w:tcW w:type="dxa" w:w="2880"/>
+          </w:tcPr>
+          <w:p>
+            <w:pPr>
+              <w:ind w:firstLine="0"/>
+              <w:jc w:val="left"/>
+            </w:pPr>
+            <w:r>
+              <w:rPr>
+                <w:rFonts w:ascii="Times New Roman" w:hAnsi="Times New Roman"/>
+                <w:sz w:val="24"/>
+              </w:rPr>
+              <w:t>vehicle_id</w:t>
+            </w:r>
+          </w:p>
+        </w:tc>
+        <w:tc>
+          <w:tcPr>
+            <w:tcW w:type="dxa" w:w="2880"/>
+          </w:tcPr>
+          <w:p>
+            <w:pPr>
+              <w:ind w:firstLine="0"/>
+              <w:jc w:val="left"/>
+            </w:pPr>
+            <w:r>
+              <w:rPr>
+                <w:rFonts w:ascii="Times New Roman" w:hAnsi="Times New Roman"/>
+                <w:sz w:val="24"/>
+              </w:rPr>
+              <w:t>Khóa chính</w:t>
+            </w:r>
+          </w:p>
+        </w:tc>
+        <w:tc>
+          <w:tcPr>
+            <w:tcW w:type="dxa" w:w="2880"/>
+          </w:tcPr>
+          <w:p>
+            <w:pPr>
+              <w:ind w:firstLine="0"/>
+              <w:jc w:val="left"/>
+            </w:pPr>
+            <w:r>
+              <w:rPr>
+                <w:rFonts w:ascii="Times New Roman" w:hAnsi="Times New Roman"/>
+                <w:sz w:val="24"/>
+              </w:rPr>
+              <w:t>PK</w:t>
+            </w:r>
+          </w:p>
+        </w:tc>
+      </w:tr>
+      <w:tr>
+        <w:tc>
+          <w:tcPr>
+            <w:tcW w:type="dxa" w:w="2880"/>
+          </w:tcPr>
+          <w:p>
+            <w:pPr>
+              <w:ind w:firstLine="0"/>
+              <w:jc w:val="left"/>
+            </w:pPr>
+            <w:r>
+              <w:rPr>
+                <w:rFonts w:ascii="Times New Roman" w:hAnsi="Times New Roman"/>
+                <w:sz w:val="24"/>
+              </w:rPr>
+              <w:t>plate_number</w:t>
+            </w:r>
+          </w:p>
+        </w:tc>
+        <w:tc>
+          <w:tcPr>
+            <w:tcW w:type="dxa" w:w="2880"/>
+          </w:tcPr>
+          <w:p>
+            <w:pPr>
+              <w:ind w:firstLine="0"/>
+              <w:jc w:val="left"/>
+            </w:pPr>
+            <w:r>
+              <w:rPr>
+                <w:rFonts w:ascii="Times New Roman" w:hAnsi="Times New Roman"/>
+                <w:sz w:val="24"/>
+              </w:rPr>
+              <w:t>Biển số xe</w:t>
+            </w:r>
+          </w:p>
+        </w:tc>
+        <w:tc>
+          <w:tcPr>
+            <w:tcW w:type="dxa" w:w="2880"/>
+          </w:tcPr>
+          <w:p>
+            <w:pPr>
+              <w:ind w:firstLine="0"/>
+              <w:jc w:val="left"/>
+            </w:pPr>
+            <w:r>
+              <w:rPr>
+                <w:rFonts w:ascii="Times New Roman" w:hAnsi="Times New Roman"/>
+                <w:sz w:val="24"/>
+              </w:rPr>
+              <w:t>Duy nhất</w:t>
+            </w:r>
+          </w:p>
+        </w:tc>
+      </w:tr>
+      <w:tr>
+        <w:tc>
+          <w:tcPr>
+            <w:tcW w:type="dxa" w:w="2880"/>
+          </w:tcPr>
+          <w:p>
+            <w:pPr>
+              <w:ind w:firstLine="0"/>
+              <w:jc w:val="left"/>
+            </w:pPr>
+            <w:r>
+              <w:rPr>
+                <w:rFonts w:ascii="Times New Roman" w:hAnsi="Times New Roman"/>
+                <w:sz w:val="24"/>
+              </w:rPr>
+              <w:t>vehicle_type</w:t>
+            </w:r>
+          </w:p>
+        </w:tc>
+        <w:tc>
+          <w:tcPr>
+            <w:tcW w:type="dxa" w:w="2880"/>
+          </w:tcPr>
+          <w:p>
+            <w:pPr>
+              <w:ind w:firstLine="0"/>
+              <w:jc w:val="left"/>
+            </w:pPr>
+            <w:r>
+              <w:rPr>
+                <w:rFonts w:ascii="Times New Roman" w:hAnsi="Times New Roman"/>
+                <w:sz w:val="24"/>
+              </w:rPr>
+              <w:t>Loại xe (xe đầu kéo, xe tải...)</w:t>
+            </w:r>
+          </w:p>
+        </w:tc>
+        <w:tc>
+          <w:tcPr>
+            <w:tcW w:type="dxa" w:w="2880"/>
+          </w:tcPr>
+          <w:p>
+            <w:pPr>
+              <w:ind w:firstLine="0"/>
+              <w:jc w:val="left"/>
+            </w:pPr>
+            <w:r>
+              <w:rPr>
+                <w:rFonts w:ascii="Times New Roman" w:hAnsi="Times New Roman"/>
+                <w:sz w:val="24"/>
+              </w:rPr>
+            </w:r>
+          </w:p>
+        </w:tc>
+      </w:tr>
+      <w:tr>
+        <w:tc>
+          <w:tcPr>
+            <w:tcW w:type="dxa" w:w="2880"/>
+          </w:tcPr>
+          <w:p>
+            <w:pPr>
+              <w:ind w:firstLine="0"/>
+              <w:jc w:val="left"/>
+            </w:pPr>
+            <w:r>
+              <w:rPr>
+                <w:rFonts w:ascii="Times New Roman" w:hAnsi="Times New Roman"/>
+                <w:sz w:val="24"/>
+              </w:rPr>
+              <w:t>capacity</w:t>
+            </w:r>
+          </w:p>
+        </w:tc>
+        <w:tc>
+          <w:tcPr>
+            <w:tcW w:type="dxa" w:w="2880"/>
+          </w:tcPr>
+          <w:p>
+            <w:pPr>
+              <w:ind w:firstLine="0"/>
+              <w:jc w:val="left"/>
+            </w:pPr>
+            <w:r>
+              <w:rPr>
+                <w:rFonts w:ascii="Times New Roman" w:hAnsi="Times New Roman"/>
+                <w:sz w:val="24"/>
+              </w:rPr>
+              <w:t>Tải trọng tối đa</w:t>
+            </w:r>
+          </w:p>
+        </w:tc>
+        <w:tc>
+          <w:tcPr>
+            <w:tcW w:type="dxa" w:w="2880"/>
+          </w:tcPr>
+          <w:p>
+            <w:pPr>
+              <w:ind w:firstLine="0"/>
+              <w:jc w:val="left"/>
+            </w:pPr>
+            <w:r>
+              <w:rPr>
+                <w:rFonts w:ascii="Times New Roman" w:hAnsi="Times New Roman"/>
+                <w:sz w:val="24"/>
+              </w:rPr>
+            </w:r>
+          </w:p>
+        </w:tc>
+      </w:tr>
+      <w:tr>
+        <w:tc>
+          <w:tcPr>
+            <w:tcW w:type="dxa" w:w="2880"/>
+          </w:tcPr>
+          <w:p>
+            <w:pPr>
+              <w:ind w:firstLine="0"/>
+              <w:jc w:val="left"/>
+            </w:pPr>
+            <w:r>
+              <w:rPr>
+                <w:rFonts w:ascii="Times New Roman" w:hAnsi="Times New Roman"/>
+                <w:sz w:val="24"/>
+              </w:rPr>
+              <w:t>status</w:t>
+            </w:r>
+          </w:p>
+        </w:tc>
+        <w:tc>
+          <w:tcPr>
+            <w:tcW w:type="dxa" w:w="2880"/>
+          </w:tcPr>
+          <w:p>
+            <w:pPr>
+              <w:ind w:firstLine="0"/>
+              <w:jc w:val="left"/>
+            </w:pPr>
+            <w:r>
+              <w:rPr>
+                <w:rFonts w:ascii="Times New Roman" w:hAnsi="Times New Roman"/>
+                <w:sz w:val="24"/>
+              </w:rPr>
+              <w:t>AVAILABLE, IN_USE, MAINTENANCE</w:t>
+            </w:r>
+          </w:p>
+        </w:tc>
+        <w:tc>
+          <w:tcPr>
+            <w:tcW w:type="dxa" w:w="2880"/>
+          </w:tcPr>
+          <w:p>
+            <w:pPr>
+              <w:ind w:firstLine="0"/>
+              <w:jc w:val="left"/>
+            </w:pPr>
+            <w:r>
+              <w:rPr>
+                <w:rFonts w:ascii="Times New Roman" w:hAnsi="Times New Roman"/>
+                <w:sz w:val="24"/>
+              </w:rPr>
+              <w:t>Trạng thái sẵn sàng vận hành</w:t>
+            </w:r>
+          </w:p>
+        </w:tc>
+      </w:tr>
+      <w:tr>
+        <w:tc>
+          <w:tcPr>
+            <w:tcW w:type="dxa" w:w="2880"/>
+          </w:tcPr>
+          <w:p>
+            <w:pPr>
+              <w:ind w:firstLine="0"/>
+              <w:jc w:val="left"/>
+            </w:pPr>
+            <w:r>
+              <w:rPr>
+                <w:rFonts w:ascii="Times New Roman" w:hAnsi="Times New Roman"/>
+                <w:sz w:val="24"/>
+              </w:rPr>
+              <w:t>created_at / updated_at</w:t>
+            </w:r>
+          </w:p>
+        </w:tc>
+        <w:tc>
+          <w:tcPr>
+            <w:tcW w:type="dxa" w:w="2880"/>
+          </w:tcPr>
+          <w:p>
+            <w:pPr>
+              <w:ind w:firstLine="0"/>
+              <w:jc w:val="left"/>
+            </w:pPr>
+            <w:r>
+              <w:rPr>
+                <w:rFonts w:ascii="Times New Roman" w:hAnsi="Times New Roman"/>
+                <w:sz w:val="24"/>
+              </w:rPr>
+              <w:t>Thời điểm tạo / cập nhật</w:t>
+            </w:r>
+          </w:p>
+        </w:tc>
+        <w:tc>
+          <w:tcPr>
+            <w:tcW w:type="dxa" w:w="2880"/>
+          </w:tcPr>
+          <w:p>
+            <w:pPr>
+              <w:ind w:firstLine="0"/>
+              <w:jc w:val="left"/>
+            </w:pPr>
+            <w:r>
+              <w:rPr>
+                <w:rFonts w:ascii="Times New Roman" w:hAnsi="Times New Roman"/>
+                <w:sz w:val="24"/>
+              </w:rPr>
+            </w:r>
+          </w:p>
+        </w:tc>
+      </w:tr>
+    </w:tbl>
+    <w:p>
+      <w:pPr>
         <w:pStyle w:val="Heading1"/>
       </w:pPr>
       <w:r>
@@ -7440,7 +7910,7 @@
                 <w:rFonts w:ascii="Times New Roman" w:hAnsi="Times New Roman"/>
                 <w:sz w:val="24"/>
               </w:rPr>
-              <w:t>Tính điểm và đề xuất Slot phải phản hồi &lt; 2 giây với bãi quy mô hàng nghìn slot, kể cả khi tính thêm disruption cost cho Relocation.</w:t>
+              <w:t>Các API tra cứu danh sách (container, warehouse, yard visit...) phải phản hồi &lt; 2 giây với dữ liệu quy mô hàng nghìn bản ghi.</w:t>
             </w:r>
           </w:p>
         </w:tc>
@@ -7478,7 +7948,7 @@
                 <w:rFonts w:ascii="Times New Roman" w:hAnsi="Times New Roman"/>
                 <w:sz w:val="24"/>
               </w:rPr>
-              <w:t>Mọi thay đổi current_slot_id bắt buộc đi qua một bản ghi Movement. Mọi thay đổi Slot.status bắt buộc khớp với state machine ở mục 4.4 tài liệu State Business.</w:t>
+              <w:t>Mọi thay đổi current_warehouse_id bắt buộc đi qua một bản ghi Movement — không sửa trực tiếp.</w:t>
             </w:r>
           </w:p>
         </w:tc>
@@ -7845,7 +8315,7 @@
                 <w:rFonts w:ascii="Times New Roman" w:hAnsi="Times New Roman"/>
                 <w:sz w:val="24"/>
               </w:rPr>
-              <w:t>Cache dữ liệu tra cứu tần suất cao (slot trống, thông tin container) để giảm tải database.</w:t>
+              <w:t>Cache dữ liệu tra cứu tần suất cao (dung lượng Warehouse, thông tin container) để giảm tải database.</w:t>
             </w:r>
           </w:p>
         </w:tc>
@@ -7921,7 +8391,7 @@
                 <w:rFonts w:ascii="Times New Roman" w:hAnsi="Times New Roman"/>
                 <w:sz w:val="24"/>
               </w:rPr>
-              <w:t>Unit test và integration test cho các module nghiệp vụ chính (Slot Allocation, tính Invoice/Payment); có mục tiêu coverage tối thiểu theo thống nhất của nhóm.</w:t>
+              <w:t>Unit test và integration test cho các module nghiệp vụ chính (gán Kho lưu trữ, tính Invoice/Payment); có mục tiêu coverage tối thiểu theo thống nhất của nhóm.</w:t>
             </w:r>
           </w:p>
         </w:tc>
@@ -8149,7 +8619,7 @@
                 <w:rFonts w:ascii="Times New Roman" w:hAnsi="Times New Roman"/>
                 <w:sz w:val="24"/>
               </w:rPr>
-              <w:t>Script sinh dữ liệu mẫu tối thiểu 2000 bản ghi (container, slot, shipment...) phục vụ kiểm thử hiệu năng và demo.</w:t>
+              <w:t>Script sinh dữ liệu mẫu tối thiểu 2000 bản ghi (container, warehouse, shipment, vehicle...) phục vụ kiểm thử hiệu năng và demo.</w:t>
             </w:r>
           </w:p>
         </w:tc>
@@ -8177,7 +8647,7 @@
         <w:pStyle w:val="ListBullet"/>
       </w:pPr>
       <w:r>
-        <w:t>SRS_ERD_Kho_bai_Container_v1.drawio — cần cập nhật thêm status CANCELLED (YardVisit), làm rõ ranh giới Management DB / Optimize DB (vấn đề tách 2 database — xem thảo luận riêng, chưa đưa vào bản v5 này).</w:t>
+        <w:t>SRS_ERD_Kho_bai_Container_v1.drawio — đã cập nhật: thêm Warehouse, Vehicle; bỏ Slot/Optimize (1 schema duy nhất).</w:t>
       </w:r>
     </w:p>
     <w:p>
@@ -8185,7 +8655,7 @@
         <w:pStyle w:val="ListBullet"/>
       </w:pPr>
       <w:r>
-        <w:t>SRS_HLD_Kho_bai_Container_v3.drawio — kiến trúc 2 service, 2 database, Message Broker.</w:t>
+        <w:t>SRS_HLD_Kho_bai_Container_v3.drawio — kiến trúc 1 service (Management), 1 database.</w:t>
       </w:r>
     </w:p>
     <w:p>

</xml_diff>